<commit_message>
feat(invoice-processing): generalize skill and remove courier fee category
- Desensitize template assets (receipt template, monthly summary, example)
- Generalize README and skill docs from xile-team specific to generic use
- Drop 快递费 (courier) category: scripts, SKILL.md, README, docx/xlsx templates
- Replace real names/companies/invoices in assets with generic placeholders
- Update example totals and doctests to match (1857.02 -> 1230.62)
- Remove stale AGENTS.md
</commit_message>
<xml_diff>
--- a/skills/invoice-processing/assets/报销申请单模版.docx
+++ b/skills/invoice-processing/assets/报销申请单模版.docx
@@ -1207,7 +1207,7 @@
                       <w:sz w:val="22"/>
                       <w:szCs w:val="22"/>
                     </w:rPr>
-                    <w:t xml:space="preserve">boss职位发布</w:t>
+                    <w:t xml:space="preserve">招聘职位发布</w:t>
                   </w:r>
                 </w:p>
               </w:tc>
@@ -1649,7 +1649,7 @@
                       <w:sz w:val="22"/>
                       <w:szCs w:val="22"/>
                     </w:rPr>
-                    <w:t xml:space="preserve">7.7 北京-厦门 洪小坚合同</w:t>
+                    <w:t xml:space="preserve">7.7 北京-厦门 钱一合同</w:t>
                   </w:r>
                 </w:p>
               </w:tc>
@@ -1746,7 +1746,7 @@
                       <w:sz w:val="22"/>
                       <w:szCs w:val="22"/>
                     </w:rPr>
-                    <w:t xml:space="preserve">7.7 北京-北京 纸院摄像头 （武军卓）</w:t>
+                    <w:t xml:space="preserve">7.7 北京-北京 办公摄像头 （陈二）</w:t>
                   </w:r>
                 </w:p>
               </w:tc>
@@ -2188,352 +2188,7 @@
                       <w:sz w:val="22"/>
                       <w:szCs w:val="22"/>
                     </w:rPr>
-                    <w:t xml:space="preserve">5.8 单位-平安银行5.8 平安银行-单位6.8 单位-家 加班6.15 单位-家 黄卉北京出差吃饭陪同 结束晚 打车回家</w:t>
-                  </w:r>
-                </w:p>
-              </w:tc>
-            </w:tr>
-            <w:tr>
-              <w:tc>
-                <w:tcPr>
-                  <w:tcW w:w="1500" w:type="dxa"/>
-                  <w:vAlign w:val="center"/>
-                </w:tcPr>
-                <w:p>
-                  <w:pPr>
-                    <w:jc w:val="center"/>
-                  </w:pPr>
-                  <w:r>
-                    <w:rPr>
-                      <w:rFonts w:ascii="宋体" w:hAnsi="宋体" w:eastAsia="宋体"/>
-                      <w:sz w:val="22"/>
-                      <w:szCs w:val="22"/>
-                    </w:rPr>
-                    <w:t xml:space="preserve"/>
-                  </w:r>
-                </w:p>
-              </w:tc>
-              <w:tc>
-                <w:tcPr>
-                  <w:tcW w:w="1500" w:type="dxa"/>
-                  <w:vAlign w:val="center"/>
-                </w:tcPr>
-                <w:p>
-                  <w:pPr>
-                    <w:jc w:val="center"/>
-                  </w:pPr>
-                  <w:r>
-                    <w:rPr>
-                      <w:rFonts w:ascii="宋体" w:hAnsi="宋体" w:eastAsia="宋体"/>
-                      <w:sz w:val="22"/>
-                      <w:szCs w:val="22"/>
-                    </w:rPr>
-                    <w:t xml:space="preserve"/>
-                  </w:r>
-                </w:p>
-              </w:tc>
-              <w:tc>
-                <w:tcPr>
-                  <w:tcW w:w="1500" w:type="dxa"/>
-                  <w:vAlign w:val="center"/>
-                </w:tcPr>
-                <w:p>
-                  <w:pPr>
-                    <w:jc w:val="center"/>
-                  </w:pPr>
-                  <w:r>
-                    <w:rPr>
-                      <w:rFonts w:ascii="宋体" w:hAnsi="宋体" w:eastAsia="宋体"/>
-                      <w:sz w:val="22"/>
-                      <w:szCs w:val="22"/>
-                    </w:rPr>
-                    <w:t xml:space="preserve"/>
-                  </w:r>
-                </w:p>
-              </w:tc>
-              <w:tc>
-                <w:tcPr>
-                  <w:tcW w:w="1500" w:type="dxa"/>
-                  <w:vAlign w:val="center"/>
-                </w:tcPr>
-                <w:p>
-                  <w:pPr>
-                    <w:jc w:val="center"/>
-                  </w:pPr>
-                  <w:r>
-                    <w:rPr>
-                      <w:rFonts w:ascii="宋体" w:hAnsi="宋体" w:eastAsia="宋体"/>
-                      <w:sz w:val="22"/>
-                      <w:szCs w:val="22"/>
-                    </w:rPr>
-                    <w:t xml:space="preserve"/>
-                  </w:r>
-                </w:p>
-              </w:tc>
-              <w:tc>
-                <w:tcPr>
-                  <w:tcW w:w="1500" w:type="dxa"/>
-                  <w:vAlign w:val="center"/>
-                </w:tcPr>
-                <w:p>
-                  <w:pPr>
-                    <w:jc w:val="left"/>
-                  </w:pPr>
-                  <w:r>
-                    <w:rPr>
-                      <w:rFonts w:ascii="宋体" w:hAnsi="宋体" w:eastAsia="宋体"/>
-                      <w:sz w:val="22"/>
-                      <w:szCs w:val="22"/>
-                    </w:rPr>
-                    <w:t xml:space="preserve"/>
-                  </w:r>
-                </w:p>
-              </w:tc>
-            </w:tr>
-            <w:tr>
-              <w:tc>
-                <w:tcPr>
-                  <w:tcW w:w="1500" w:type="dxa"/>
-                  <w:vAlign w:val="center"/>
-                </w:tcPr>
-                <w:p>
-                  <w:pPr>
-                    <w:jc w:val="center"/>
-                  </w:pPr>
-                  <w:r>
-                    <w:rPr>
-                      <w:rFonts w:ascii="宋体" w:hAnsi="宋体" w:eastAsia="宋体"/>
-                      <w:sz w:val="22"/>
-                      <w:szCs w:val="22"/>
-                    </w:rPr>
-                    <w:t xml:space="preserve"/>
-                  </w:r>
-                </w:p>
-              </w:tc>
-              <w:tc>
-                <w:tcPr>
-                  <w:tcW w:w="1500" w:type="dxa"/>
-                  <w:vAlign w:val="center"/>
-                </w:tcPr>
-                <w:p>
-                  <w:pPr>
-                    <w:jc w:val="center"/>
-                  </w:pPr>
-                  <w:r>
-                    <w:rPr>
-                      <w:rFonts w:ascii="宋体" w:hAnsi="宋体" w:eastAsia="宋体"/>
-                      <w:sz w:val="22"/>
-                      <w:szCs w:val="22"/>
-                    </w:rPr>
-                    <w:t xml:space="preserve"/>
-                  </w:r>
-                </w:p>
-              </w:tc>
-              <w:tc>
-                <w:tcPr>
-                  <w:tcW w:w="1500" w:type="dxa"/>
-                  <w:vAlign w:val="center"/>
-                </w:tcPr>
-                <w:p>
-                  <w:pPr>
-                    <w:jc w:val="center"/>
-                  </w:pPr>
-                  <w:r>
-                    <w:rPr>
-                      <w:rFonts w:ascii="宋体" w:hAnsi="宋体" w:eastAsia="宋体"/>
-                      <w:sz w:val="22"/>
-                      <w:szCs w:val="22"/>
-                    </w:rPr>
-                    <w:t xml:space="preserve"/>
-                  </w:r>
-                </w:p>
-              </w:tc>
-              <w:tc>
-                <w:tcPr>
-                  <w:tcW w:w="1500" w:type="dxa"/>
-                  <w:vAlign w:val="center"/>
-                </w:tcPr>
-                <w:p>
-                  <w:pPr>
-                    <w:jc w:val="center"/>
-                  </w:pPr>
-                  <w:r>
-                    <w:rPr>
-                      <w:rFonts w:ascii="宋体" w:hAnsi="宋体" w:eastAsia="宋体"/>
-                      <w:sz w:val="22"/>
-                      <w:szCs w:val="22"/>
-                    </w:rPr>
-                    <w:t xml:space="preserve"/>
-                  </w:r>
-                </w:p>
-              </w:tc>
-              <w:tc>
-                <w:tcPr>
-                  <w:tcW w:w="1500" w:type="dxa"/>
-                  <w:vAlign w:val="center"/>
-                </w:tcPr>
-                <w:p>
-                  <w:pPr>
-                    <w:jc w:val="left"/>
-                  </w:pPr>
-                  <w:r>
-                    <w:rPr>
-                      <w:rFonts w:ascii="宋体" w:hAnsi="宋体" w:eastAsia="宋体"/>
-                      <w:sz w:val="22"/>
-                      <w:szCs w:val="22"/>
-                    </w:rPr>
-                    <w:t xml:space="preserve"/>
-                  </w:r>
-                </w:p>
-              </w:tc>
-            </w:tr>
-          </w:tbl>
-          <w:p/>
-          <w:p>
-            <w:pPr>
-              <w:jc w:val="left"/>
-            </w:pPr>
-            <w:r>
-              <w:rPr>
-                <w:rFonts w:hint="eastAsia" w:ascii="Tahoma" w:hAnsi="Tahoma" w:eastAsia="宋体" w:cs="Tahoma"/>
-                <w:b/>
-                <w:bCs/>
-                <w:color w:val="3C3C3C"/>
-                <w:kern w:val="0"/>
-                <w:sz w:val="24"/>
-                <w:szCs w:val="24"/>
-                <w:lang w:val="en-US" w:eastAsia="zh-CN"/>
-              </w:rPr>
-              <w:t xml:space="preserve">快递费用（　）</w:t>
-            </w:r>
-          </w:p>
-          <w:tbl>
-            <w:tblPr>
-              <w:tblStyle w:val="2"/>
-              <w:tblW w:w="7997" w:type="dxa"/>
-              <w:tblInd w:w="-12" w:type="dxa"/>
-              <w:tblBorders>
-                <w:top w:val="none" w:color="auto" w:sz="0" w:space="0"/>
-                <w:left w:val="none" w:color="auto" w:sz="0" w:space="0"/>
-                <w:bottom w:val="none" w:color="auto" w:sz="0" w:space="0"/>
-                <w:right w:val="none" w:color="auto" w:sz="0" w:space="0"/>
-                <w:insideH w:val="none" w:color="auto" w:sz="0" w:space="0"/>
-                <w:insideV w:val="none" w:color="auto" w:sz="0" w:space="0"/>
-              </w:tblBorders>
-              <w:shd w:val="clear" w:color="auto" w:fill="auto"/>
-              <w:tblLayout w:type="fixed"/>
-              <w:tblCellMar>
-                <w:top w:w="0" w:type="dxa"/>
-                <w:left w:w="108" w:type="dxa"/>
-                <w:bottom w:w="0" w:type="dxa"/>
-                <w:right w:w="108" w:type="dxa"/>
-              </w:tblCellMar>
-            </w:tblPr>
-            <w:tblGrid>
-              <w:gridCol w:w="446"/>
-              <w:gridCol w:w="1395"/>
-              <w:gridCol w:w="1010"/>
-              <w:gridCol w:w="563"/>
-              <w:gridCol w:w="4583"/>
-            </w:tblGrid>
-            <w:tr>
-              <w:tc>
-                <w:tcPr>
-                  <w:tcW w:w="1500" w:type="dxa"/>
-                  <w:vAlign w:val="center"/>
-                </w:tcPr>
-                <w:p>
-                  <w:pPr>
-                    <w:jc w:val="center"/>
-                  </w:pPr>
-                  <w:r>
-                    <w:rPr>
-                      <w:rFonts w:ascii="宋体" w:hAnsi="宋体" w:eastAsia="宋体"/>
-                      <w:b/>
-                      <w:sz w:val="22"/>
-                      <w:szCs w:val="22"/>
-                    </w:rPr>
-                    <w:t xml:space="preserve">序号</w:t>
-                  </w:r>
-                </w:p>
-              </w:tc>
-              <w:tc>
-                <w:tcPr>
-                  <w:tcW w:w="1500" w:type="dxa"/>
-                  <w:vAlign w:val="center"/>
-                </w:tcPr>
-                <w:p>
-                  <w:pPr>
-                    <w:jc w:val="center"/>
-                  </w:pPr>
-                  <w:r>
-                    <w:rPr>
-                      <w:rFonts w:ascii="宋体" w:hAnsi="宋体" w:eastAsia="宋体"/>
-                      <w:b/>
-                      <w:sz w:val="22"/>
-                      <w:szCs w:val="22"/>
-                    </w:rPr>
-                    <w:t xml:space="preserve">日期</w:t>
-                  </w:r>
-                </w:p>
-              </w:tc>
-              <w:tc>
-                <w:tcPr>
-                  <w:tcW w:w="1500" w:type="dxa"/>
-                  <w:vAlign w:val="center"/>
-                </w:tcPr>
-                <w:p>
-                  <w:pPr>
-                    <w:jc w:val="center"/>
-                  </w:pPr>
-                  <w:r>
-                    <w:rPr>
-                      <w:rFonts w:ascii="宋体" w:hAnsi="宋体" w:eastAsia="宋体"/>
-                      <w:b/>
-                      <w:sz w:val="22"/>
-                      <w:szCs w:val="22"/>
-                    </w:rPr>
-                    <w:t xml:space="preserve">金额</w:t>
-                  </w:r>
-                </w:p>
-              </w:tc>
-              <w:tc>
-                <w:tcPr>
-                  <w:tcW w:w="1500" w:type="dxa"/>
-                  <w:vAlign w:val="center"/>
-                </w:tcPr>
-                <w:p>
-                  <w:pPr>
-                    <w:jc w:val="center"/>
-                  </w:pPr>
-                  <w:r>
-                    <w:rPr>
-                      <w:rFonts w:ascii="宋体" w:hAnsi="宋体" w:eastAsia="宋体"/>
-                      <w:b/>
-                      <w:sz w:val="22"/>
-                      <w:szCs w:val="22"/>
-                    </w:rPr>
-                    <w:t xml:space="preserve">元</w:t>
-                  </w:r>
-                </w:p>
-              </w:tc>
-              <w:tc>
-                <w:tcPr>
-                  <w:tcW w:w="1500" w:type="dxa"/>
-                  <w:vAlign w:val="center"/>
-                </w:tcPr>
-                <w:p>
-                  <w:pPr>
-                    <w:jc w:val="left"/>
-                  </w:pPr>
-                  <w:r>
-                    <w:rPr>
-                      <w:rFonts w:ascii="宋体" w:hAnsi="宋体" w:eastAsia="宋体"/>
-                      <w:b/>
-                      <w:sz w:val="22"/>
-                      <w:szCs w:val="22"/>
-                    </w:rPr>
-                    <w:t xml:space="preserve">说明</w:t>
+                    <w:t xml:space="preserve">5.8 单位-某银行5.8 某银行-单位6.8 单位-家 加班6.15 单位-家 李四北京出差吃饭陪同 结束晚 打车回家</w:t>
                   </w:r>
                 </w:p>
               </w:tc>
@@ -2836,7 +2491,7 @@
           <w:b w:val="0"/>
           <w:sz w:val="22"/>
         </w:rPr>
-        <w:t>每类发票需放入对应的分类文件夹：餐饮费用（餐费）、办公费用（饮料、办公用品、名片/logo/标书制作费）、差旅费用（机票、行程单、高铁票、火车票、住宿、退票费）、交通费用（打车费）、快递费用（快递费）。</w:t>
+        <w:t>每类发票需放入对应的分类文件夹：餐饮费用（餐费）、办公费用（饮料、办公用品、名片/logo/标书制作费）、差旅费用（机票、行程单、高铁票、火车票、住宿、退票费）、交通费用（打车费）。</w:t>
       </w:r>
     </w:p>
     <w:tbl>
@@ -3259,31 +2914,11 @@
           <w:tcPr>
             <w:tcW w:type="dxa" w:w="2381"/>
           </w:tcPr>
-          <w:p>
-            <w:r>
-              <w:rPr>
-                <w:rFonts w:ascii="宋体" w:hAnsi="宋体" w:eastAsia="宋体"/>
-                <w:b w:val="0"/>
-                <w:sz w:val="22"/>
-              </w:rPr>
-              <w:t>备注-快递费用</w:t>
-            </w:r>
-          </w:p>
         </w:tc>
         <w:tc>
           <w:tcPr>
             <w:tcW w:type="dxa" w:w="7370"/>
           </w:tcPr>
-          <w:p>
-            <w:r>
-              <w:rPr>
-                <w:rFonts w:ascii="宋体" w:hAnsi="宋体" w:eastAsia="宋体"/>
-                <w:b w:val="0"/>
-                <w:sz w:val="22"/>
-              </w:rPr>
-              <w:t>填写快递费发票金额合计</w:t>
-            </w:r>
-          </w:p>
         </w:tc>
       </w:tr>
       <w:tr>

</xml_diff>